<commit_message>
Bootstrap & React-Bootstrap installs
</commit_message>
<xml_diff>
--- a/documentation.docx
+++ b/documentation.docx
@@ -75,7 +75,15 @@
         </w:numPr>
       </w:pPr>
       <w:r>
-        <w:t>Git documentation that is dev-facing. Used to introduce project to the world when looking at git repo. Should contain tech-stack, summary of project, and how to install/run.</w:t>
+        <w:t xml:space="preserve">Git documentation that is dev-facing. Used to introduce project to the world when looking at </w:t>
+      </w:r>
+      <w:proofErr w:type="spellStart"/>
+      <w:r>
+        <w:t>git</w:t>
+      </w:r>
+      <w:proofErr w:type="spellEnd"/>
+      <w:r>
+        <w:t xml:space="preserve"> repo. Should contain tech-stack, summary of project, and how to install/run.</w:t>
       </w:r>
     </w:p>
     <w:p>
@@ -110,9 +118,11 @@
           <w:numId w:val="1"/>
         </w:numPr>
       </w:pPr>
+      <w:proofErr w:type="spellStart"/>
       <w:r>
         <w:t>package.json</w:t>
       </w:r>
+      <w:proofErr w:type="spellEnd"/>
     </w:p>
     <w:p>
       <w:pPr>
@@ -167,70 +177,287 @@
         </w:rPr>
         <w:lastRenderedPageBreak/>
         <w:br/>
-      </w:r>
-      <w:r>
-        <w:rPr>
-          <w:b/>
-          <w:bCs/>
-          <w:color w:val="0E2841" w:themeColor="text2"/>
-          <w:sz w:val="32"/>
-          <w:szCs w:val="32"/>
-        </w:rPr>
-        <w:t>resume-site</w:t>
-      </w:r>
-      <w:r>
-        <w:rPr>
-          <w:b/>
-          <w:bCs/>
-          <w:color w:val="0E2841" w:themeColor="text2"/>
-          <w:sz w:val="32"/>
-          <w:szCs w:val="32"/>
-        </w:rPr>
+        <w:t>resume-site (Website Root)</w:t>
+      </w:r>
+    </w:p>
+    <w:p>
+      <w:pPr>
+        <w:pStyle w:val="ListParagraph"/>
+        <w:numPr>
+          <w:ilvl w:val="0"/>
+          <w:numId w:val="1"/>
+        </w:numPr>
+      </w:pPr>
+      <w:r>
+        <w:t>Contains source code, settings, libraries and node modules for the website.</w:t>
+      </w:r>
+    </w:p>
+    <w:p>
+      <w:pPr>
+        <w:pStyle w:val="ListParagraph"/>
+        <w:numPr>
+          <w:ilvl w:val="0"/>
+          <w:numId w:val="1"/>
+        </w:numPr>
+      </w:pPr>
+      <w:r>
+        <w:t>This portion of the documentation will be separated into several categories for ease of reading</w:t>
+      </w:r>
+    </w:p>
+    <w:p>
+      <w:pPr>
+        <w:pStyle w:val="ListParagraph"/>
+        <w:numPr>
+          <w:ilvl w:val="1"/>
+          <w:numId w:val="1"/>
+        </w:numPr>
+      </w:pPr>
+      <w:r>
+        <w:t>Settings</w:t>
+      </w:r>
+      <w:r>
+        <w:t xml:space="preserve"> (Website Project Root)</w:t>
+      </w:r>
+    </w:p>
+    <w:p>
+      <w:pPr>
+        <w:pStyle w:val="ListParagraph"/>
+        <w:numPr>
+          <w:ilvl w:val="2"/>
+          <w:numId w:val="1"/>
+        </w:numPr>
+      </w:pPr>
+      <w:proofErr w:type="spellStart"/>
+      <w:r>
+        <w:t>package.json</w:t>
+      </w:r>
+      <w:proofErr w:type="spellEnd"/>
+    </w:p>
+    <w:p>
+      <w:pPr>
+        <w:pStyle w:val="ListParagraph"/>
+        <w:numPr>
+          <w:ilvl w:val="3"/>
+          <w:numId w:val="1"/>
+        </w:numPr>
+      </w:pPr>
+      <w:r>
+        <w:t>Contains scripts and dependencies. Also contains metadata, such as name of project, version of project, etc.</w:t>
+      </w:r>
+    </w:p>
+    <w:p>
+      <w:pPr>
+        <w:pStyle w:val="ListParagraph"/>
+        <w:numPr>
+          <w:ilvl w:val="2"/>
+          <w:numId w:val="1"/>
+        </w:numPr>
+      </w:pPr>
+      <w:r>
+        <w:t>package-</w:t>
+      </w:r>
+      <w:proofErr w:type="spellStart"/>
+      <w:r>
+        <w:t>lock.json</w:t>
+      </w:r>
+      <w:proofErr w:type="spellEnd"/>
+      <w:r>
+        <w:t xml:space="preserve"> (build output)</w:t>
+      </w:r>
+    </w:p>
+    <w:p>
+      <w:pPr>
+        <w:pStyle w:val="ListParagraph"/>
+        <w:numPr>
+          <w:ilvl w:val="3"/>
+          <w:numId w:val="1"/>
+        </w:numPr>
+      </w:pPr>
+      <w:r>
+        <w:t xml:space="preserve">“Locks” exact versions of </w:t>
+      </w:r>
+      <w:proofErr w:type="spellStart"/>
+      <w:r>
+        <w:t>npm</w:t>
+      </w:r>
+      <w:proofErr w:type="spellEnd"/>
+      <w:r>
+        <w:t xml:space="preserve"> dependences, so consistent installs are made across all builds.</w:t>
+      </w:r>
+    </w:p>
+    <w:p>
+      <w:pPr>
+        <w:pStyle w:val="ListParagraph"/>
+        <w:numPr>
+          <w:ilvl w:val="2"/>
+          <w:numId w:val="1"/>
+        </w:numPr>
+      </w:pPr>
+      <w:proofErr w:type="spellStart"/>
+      <w:r>
+        <w:t>vite.config.ts</w:t>
+      </w:r>
+      <w:proofErr w:type="spellEnd"/>
+    </w:p>
+    <w:p>
+      <w:pPr>
+        <w:pStyle w:val="ListParagraph"/>
+        <w:numPr>
+          <w:ilvl w:val="3"/>
+          <w:numId w:val="1"/>
+        </w:numPr>
+      </w:pPr>
+      <w:proofErr w:type="spellStart"/>
+      <w:r>
+        <w:t>Cofigures</w:t>
+      </w:r>
+      <w:proofErr w:type="spellEnd"/>
+      <w:r>
+        <w:t xml:space="preserve"> </w:t>
+      </w:r>
+      <w:proofErr w:type="spellStart"/>
+      <w:r>
+        <w:t>vite</w:t>
+      </w:r>
+      <w:proofErr w:type="spellEnd"/>
+      <w:r>
+        <w:t>, the build tool used for the website.</w:t>
+      </w:r>
+      <w:r>
+        <w:t xml:space="preserve"> Currently configured to use SWC for fast compilation. This determines how the app is built and served.</w:t>
+      </w:r>
+    </w:p>
+    <w:p>
+      <w:pPr>
+        <w:pStyle w:val="ListParagraph"/>
+        <w:numPr>
+          <w:ilvl w:val="2"/>
+          <w:numId w:val="1"/>
+        </w:numPr>
+      </w:pPr>
+      <w:proofErr w:type="spellStart"/>
+      <w:r>
+        <w:t>tsconfig.json</w:t>
+      </w:r>
+      <w:proofErr w:type="spellEnd"/>
+    </w:p>
+    <w:p>
+      <w:pPr>
+        <w:pStyle w:val="ListParagraph"/>
+        <w:numPr>
+          <w:ilvl w:val="3"/>
+          <w:numId w:val="1"/>
+        </w:numPr>
+      </w:pPr>
+      <w:r>
+        <w:t xml:space="preserve">Used for typescript configuration. This references </w:t>
+      </w:r>
+      <w:proofErr w:type="spellStart"/>
+      <w:r>
+        <w:t>tsconfig.app.json</w:t>
+      </w:r>
+      <w:proofErr w:type="spellEnd"/>
+      <w:r>
+        <w:t xml:space="preserve"> (application code) and </w:t>
+      </w:r>
+      <w:proofErr w:type="spellStart"/>
+      <w:r>
+        <w:t>tsconfig.node.json</w:t>
+      </w:r>
+      <w:proofErr w:type="spellEnd"/>
+      <w:r>
+        <w:t xml:space="preserve"> (build tools).</w:t>
+      </w:r>
+    </w:p>
+    <w:p>
+      <w:pPr>
+        <w:pStyle w:val="ListParagraph"/>
+        <w:numPr>
+          <w:ilvl w:val="2"/>
+          <w:numId w:val="1"/>
+        </w:numPr>
+      </w:pPr>
+      <w:r>
+        <w:t>eslint.config.js</w:t>
+      </w:r>
+    </w:p>
+    <w:p>
+      <w:pPr>
+        <w:pStyle w:val="ListParagraph"/>
+        <w:numPr>
+          <w:ilvl w:val="3"/>
+          <w:numId w:val="1"/>
+        </w:numPr>
+      </w:pPr>
+      <w:r>
+        <w:t>Defines code style.</w:t>
+      </w:r>
+    </w:p>
+    <w:p>
+      <w:pPr>
+        <w:pStyle w:val="ListParagraph"/>
+        <w:numPr>
+          <w:ilvl w:val="2"/>
+          <w:numId w:val="1"/>
+        </w:numPr>
+      </w:pPr>
+      <w:r>
+        <w:t>index.html</w:t>
+      </w:r>
+    </w:p>
+    <w:p>
+      <w:pPr>
+        <w:pStyle w:val="ListParagraph"/>
+        <w:numPr>
+          <w:ilvl w:val="3"/>
+          <w:numId w:val="1"/>
+        </w:numPr>
+      </w:pPr>
+      <w:r>
+        <w:t>Production HTML, contains HMTL template used by website. Loads the frontend HTML portion of react app. Contains HTML structure basics and script tags.</w:t>
+      </w:r>
+    </w:p>
+    <w:p>
+      <w:pPr>
+        <w:pStyle w:val="ListParagraph"/>
+        <w:numPr>
+          <w:ilvl w:val="1"/>
+          <w:numId w:val="1"/>
+        </w:numPr>
+      </w:pPr>
+      <w:r>
+        <w:t>Source Code</w:t>
+      </w:r>
+      <w:r>
         <w:t xml:space="preserve"> (</w:t>
       </w:r>
-      <w:r>
-        <w:rPr>
-          <w:b/>
-          <w:bCs/>
-          <w:color w:val="0E2841" w:themeColor="text2"/>
-          <w:sz w:val="32"/>
-          <w:szCs w:val="32"/>
-        </w:rPr>
-        <w:t>Website</w:t>
-      </w:r>
-      <w:r>
-        <w:rPr>
-          <w:b/>
-          <w:bCs/>
-          <w:color w:val="0E2841" w:themeColor="text2"/>
-          <w:sz w:val="32"/>
-          <w:szCs w:val="32"/>
-        </w:rPr>
-        <w:t xml:space="preserve"> Root)</w:t>
-      </w:r>
-    </w:p>
-    <w:p>
-      <w:pPr>
-        <w:pStyle w:val="ListParagraph"/>
-        <w:numPr>
-          <w:ilvl w:val="0"/>
-          <w:numId w:val="1"/>
-        </w:numPr>
-      </w:pPr>
-      <w:r>
-        <w:t>Contains source code, settings, libraries and node modules for the website.</w:t>
-      </w:r>
-    </w:p>
-    <w:p>
-      <w:pPr>
-        <w:pStyle w:val="ListParagraph"/>
-        <w:numPr>
-          <w:ilvl w:val="0"/>
-          <w:numId w:val="1"/>
-        </w:numPr>
-      </w:pPr>
-      <w:r>
-        <w:t>This portion of the documentation will be separated into several categories for ease of reading</w:t>
+      <w:proofErr w:type="spellStart"/>
+      <w:r>
+        <w:t>src</w:t>
+      </w:r>
+      <w:proofErr w:type="spellEnd"/>
+      <w:r>
+        <w:t xml:space="preserve"> Directory)</w:t>
+      </w:r>
+    </w:p>
+    <w:p>
+      <w:pPr>
+        <w:pStyle w:val="ListParagraph"/>
+        <w:numPr>
+          <w:ilvl w:val="2"/>
+          <w:numId w:val="1"/>
+        </w:numPr>
+      </w:pPr>
+      <w:r>
+        <w:t xml:space="preserve">(Subject to Change. Currently default of react </w:t>
+      </w:r>
+      <w:proofErr w:type="spellStart"/>
+      <w:r>
+        <w:t>vite</w:t>
+      </w:r>
+      <w:proofErr w:type="spellEnd"/>
+      <w:r>
+        <w:t xml:space="preserve"> project creation)</w:t>
       </w:r>
     </w:p>
     <w:p>
@@ -242,10 +469,10 @@
         </w:numPr>
       </w:pPr>
       <w:r>
-        <w:t>Settings</w:t>
-      </w:r>
-      <w:r>
-        <w:t xml:space="preserve"> (Website Project Root)</w:t>
+        <w:t>Node Modules</w:t>
+      </w:r>
+      <w:r>
+        <w:t xml:space="preserve"> (Directory)</w:t>
       </w:r>
     </w:p>
     <w:p>
@@ -257,7 +484,139 @@
         </w:numPr>
       </w:pPr>
       <w:r>
-        <w:t>package.json</w:t>
+        <w:t xml:space="preserve">Contains project dependencies. All install </w:t>
+      </w:r>
+      <w:proofErr w:type="spellStart"/>
+      <w:r>
+        <w:t>npm</w:t>
+      </w:r>
+      <w:proofErr w:type="spellEnd"/>
+      <w:r>
+        <w:t xml:space="preserve"> packages are installed here. Managed by </w:t>
+      </w:r>
+      <w:proofErr w:type="spellStart"/>
+      <w:r>
+        <w:t>npm</w:t>
+      </w:r>
+      <w:proofErr w:type="spellEnd"/>
+      <w:r>
+        <w:t xml:space="preserve"> console commands, should never be manually edited.</w:t>
+      </w:r>
+    </w:p>
+    <w:p>
+      <w:pPr>
+        <w:pStyle w:val="ListParagraph"/>
+        <w:numPr>
+          <w:ilvl w:val="1"/>
+          <w:numId w:val="1"/>
+        </w:numPr>
+      </w:pPr>
+      <w:r>
+        <w:t>Public</w:t>
+      </w:r>
+      <w:r>
+        <w:t xml:space="preserve"> (Directory)</w:t>
+      </w:r>
+    </w:p>
+    <w:p>
+      <w:pPr>
+        <w:pStyle w:val="ListParagraph"/>
+        <w:numPr>
+          <w:ilvl w:val="2"/>
+          <w:numId w:val="1"/>
+        </w:numPr>
+      </w:pPr>
+      <w:r>
+        <w:t xml:space="preserve">Used for </w:t>
+      </w:r>
+      <w:r>
+        <w:t xml:space="preserve">graphic </w:t>
+      </w:r>
+      <w:r>
+        <w:t>asset</w:t>
+      </w:r>
+      <w:r>
+        <w:t>s</w:t>
+      </w:r>
+      <w:r>
+        <w:t xml:space="preserve"> storage, such as pictures, logos, etc.</w:t>
+      </w:r>
+    </w:p>
+    <w:p>
+      <w:pPr>
+        <w:pStyle w:val="ListParagraph"/>
+        <w:numPr>
+          <w:ilvl w:val="1"/>
+          <w:numId w:val="1"/>
+        </w:numPr>
+      </w:pPr>
+      <w:r>
+        <w:t>Stylization</w:t>
+      </w:r>
+    </w:p>
+    <w:p>
+      <w:pPr>
+        <w:pStyle w:val="ListParagraph"/>
+        <w:numPr>
+          <w:ilvl w:val="2"/>
+          <w:numId w:val="1"/>
+        </w:numPr>
+      </w:pPr>
+      <w:r>
+        <w:t xml:space="preserve">“styles” directory contains all </w:t>
+      </w:r>
+      <w:proofErr w:type="spellStart"/>
+      <w:r>
+        <w:t>css</w:t>
+      </w:r>
+      <w:proofErr w:type="spellEnd"/>
+      <w:r>
+        <w:t>/</w:t>
+      </w:r>
+      <w:proofErr w:type="spellStart"/>
+      <w:r>
+        <w:t>scss</w:t>
+      </w:r>
+      <w:proofErr w:type="spellEnd"/>
+      <w:r>
+        <w:t xml:space="preserve"> files.</w:t>
+      </w:r>
+    </w:p>
+    <w:p>
+      <w:pPr>
+        <w:pStyle w:val="ListParagraph"/>
+        <w:numPr>
+          <w:ilvl w:val="2"/>
+          <w:numId w:val="1"/>
+        </w:numPr>
+      </w:pPr>
+      <w:r>
+        <w:lastRenderedPageBreak/>
+        <w:t xml:space="preserve">Bootstrap library was downloaded to </w:t>
+      </w:r>
+      <w:proofErr w:type="spellStart"/>
+      <w:r>
+        <w:t>npm</w:t>
+      </w:r>
+      <w:proofErr w:type="spellEnd"/>
+      <w:r>
+        <w:t xml:space="preserve"> for additional help. </w:t>
+      </w:r>
+      <w:proofErr w:type="spellStart"/>
+      <w:r>
+        <w:t>css</w:t>
+      </w:r>
+      <w:proofErr w:type="spellEnd"/>
+      <w:r>
+        <w:t>/</w:t>
+      </w:r>
+      <w:proofErr w:type="spellStart"/>
+      <w:r>
+        <w:t>scss</w:t>
+      </w:r>
+      <w:proofErr w:type="spellEnd"/>
+      <w:r>
+        <w:t xml:space="preserve"> files should only be used for specific, custom jobs.</w:t>
       </w:r>
     </w:p>
     <w:p>
@@ -269,7 +628,15 @@
         </w:numPr>
       </w:pPr>
       <w:r>
-        <w:t>Contains scripts and dependencies. Also contains metadata, such as name of project, version of project, etc.</w:t>
+        <w:t xml:space="preserve">Bootstrap is </w:t>
+      </w:r>
+      <w:proofErr w:type="spellStart"/>
+      <w:r>
+        <w:t>classname</w:t>
+      </w:r>
+      <w:proofErr w:type="spellEnd"/>
+      <w:r>
+        <w:t>-specific. It’s used to modify existing components/html classes</w:t>
       </w:r>
     </w:p>
     <w:p>
@@ -281,220 +648,7 @@
         </w:numPr>
       </w:pPr>
       <w:r>
-        <w:t>package-lock.json</w:t>
-      </w:r>
-      <w:r>
-        <w:t xml:space="preserve"> (build output)</w:t>
-      </w:r>
-    </w:p>
-    <w:p>
-      <w:pPr>
-        <w:pStyle w:val="ListParagraph"/>
-        <w:numPr>
-          <w:ilvl w:val="3"/>
-          <w:numId w:val="1"/>
-        </w:numPr>
-      </w:pPr>
-      <w:r>
-        <w:t>“Locks” exact versions of npm dependences, so consistent installs are made across all builds.</w:t>
-      </w:r>
-    </w:p>
-    <w:p>
-      <w:pPr>
-        <w:pStyle w:val="ListParagraph"/>
-        <w:numPr>
-          <w:ilvl w:val="2"/>
-          <w:numId w:val="1"/>
-        </w:numPr>
-      </w:pPr>
-      <w:r>
-        <w:t>vite.config.ts</w:t>
-      </w:r>
-    </w:p>
-    <w:p>
-      <w:pPr>
-        <w:pStyle w:val="ListParagraph"/>
-        <w:numPr>
-          <w:ilvl w:val="3"/>
-          <w:numId w:val="1"/>
-        </w:numPr>
-      </w:pPr>
-      <w:r>
-        <w:t>Cofigures vite, the build tool used for the website.</w:t>
-      </w:r>
-      <w:r>
-        <w:t xml:space="preserve"> Currently configured to use SWC for fast compilation. This determines how the app is built and served.</w:t>
-      </w:r>
-    </w:p>
-    <w:p>
-      <w:pPr>
-        <w:pStyle w:val="ListParagraph"/>
-        <w:numPr>
-          <w:ilvl w:val="2"/>
-          <w:numId w:val="1"/>
-        </w:numPr>
-      </w:pPr>
-      <w:r>
-        <w:t>tsconfig.json</w:t>
-      </w:r>
-    </w:p>
-    <w:p>
-      <w:pPr>
-        <w:pStyle w:val="ListParagraph"/>
-        <w:numPr>
-          <w:ilvl w:val="3"/>
-          <w:numId w:val="1"/>
-        </w:numPr>
-      </w:pPr>
-      <w:r>
-        <w:t>Used for typescript configuration. This references tsconfig.app.json (application code) and tsconfig.node.json (build tools).</w:t>
-      </w:r>
-    </w:p>
-    <w:p>
-      <w:pPr>
-        <w:pStyle w:val="ListParagraph"/>
-        <w:numPr>
-          <w:ilvl w:val="2"/>
-          <w:numId w:val="1"/>
-        </w:numPr>
-      </w:pPr>
-      <w:r>
-        <w:t>eslint.config.js</w:t>
-      </w:r>
-    </w:p>
-    <w:p>
-      <w:pPr>
-        <w:pStyle w:val="ListParagraph"/>
-        <w:numPr>
-          <w:ilvl w:val="3"/>
-          <w:numId w:val="1"/>
-        </w:numPr>
-      </w:pPr>
-      <w:r>
-        <w:t>Defines code style.</w:t>
-      </w:r>
-    </w:p>
-    <w:p>
-      <w:pPr>
-        <w:pStyle w:val="ListParagraph"/>
-        <w:numPr>
-          <w:ilvl w:val="2"/>
-          <w:numId w:val="1"/>
-        </w:numPr>
-      </w:pPr>
-      <w:r>
-        <w:t>index.html</w:t>
-      </w:r>
-    </w:p>
-    <w:p>
-      <w:pPr>
-        <w:pStyle w:val="ListParagraph"/>
-        <w:numPr>
-          <w:ilvl w:val="3"/>
-          <w:numId w:val="1"/>
-        </w:numPr>
-      </w:pPr>
-      <w:r>
-        <w:t>Production HTML, contains HMTL template used by website. Loads the frontend HTML portion of react app. Contains HTML structure basics and script tags.</w:t>
-      </w:r>
-    </w:p>
-    <w:p>
-      <w:pPr>
-        <w:pStyle w:val="ListParagraph"/>
-        <w:numPr>
-          <w:ilvl w:val="1"/>
-          <w:numId w:val="1"/>
-        </w:numPr>
-      </w:pPr>
-      <w:r>
-        <w:t>Source Code</w:t>
-      </w:r>
-      <w:r>
-        <w:t xml:space="preserve"> (src </w:t>
-      </w:r>
-      <w:r>
-        <w:t>Directory)</w:t>
-      </w:r>
-    </w:p>
-    <w:p>
-      <w:pPr>
-        <w:pStyle w:val="ListParagraph"/>
-        <w:numPr>
-          <w:ilvl w:val="2"/>
-          <w:numId w:val="1"/>
-        </w:numPr>
-      </w:pPr>
-      <w:r>
-        <w:t>(Subject to Change. Currently default of react vite project creation)</w:t>
-      </w:r>
-    </w:p>
-    <w:p>
-      <w:pPr>
-        <w:pStyle w:val="ListParagraph"/>
-        <w:numPr>
-          <w:ilvl w:val="1"/>
-          <w:numId w:val="1"/>
-        </w:numPr>
-      </w:pPr>
-      <w:r>
-        <w:t>Node Modules</w:t>
-      </w:r>
-      <w:r>
-        <w:t xml:space="preserve"> </w:t>
-      </w:r>
-      <w:r>
-        <w:t>(Directory)</w:t>
-      </w:r>
-    </w:p>
-    <w:p>
-      <w:pPr>
-        <w:pStyle w:val="ListParagraph"/>
-        <w:numPr>
-          <w:ilvl w:val="2"/>
-          <w:numId w:val="1"/>
-        </w:numPr>
-      </w:pPr>
-      <w:r>
-        <w:t>Contains project dependencies. All install npm packages are installed here. Managed by npm console commands, should never be manually edited.</w:t>
-      </w:r>
-    </w:p>
-    <w:p>
-      <w:pPr>
-        <w:pStyle w:val="ListParagraph"/>
-        <w:numPr>
-          <w:ilvl w:val="1"/>
-          <w:numId w:val="1"/>
-        </w:numPr>
-      </w:pPr>
-      <w:r>
-        <w:t>Public</w:t>
-      </w:r>
-      <w:r>
-        <w:t xml:space="preserve"> (Directory)</w:t>
-      </w:r>
-    </w:p>
-    <w:p>
-      <w:pPr>
-        <w:pStyle w:val="ListParagraph"/>
-        <w:numPr>
-          <w:ilvl w:val="2"/>
-          <w:numId w:val="1"/>
-        </w:numPr>
-      </w:pPr>
-      <w:r>
-        <w:t xml:space="preserve">Used for </w:t>
-      </w:r>
-      <w:r>
-        <w:t xml:space="preserve">graphic </w:t>
-      </w:r>
-      <w:r>
-        <w:t>asset</w:t>
-      </w:r>
-      <w:r>
-        <w:t>s</w:t>
-      </w:r>
-      <w:r>
-        <w:t xml:space="preserve"> storage, such as pictures, logos, etc.</w:t>
+        <w:t>React-Bootstrap is a component library that was downloaded for ease of stylized, uniform style</w:t>
       </w:r>
     </w:p>
     <w:sectPr>

</xml_diff>